<commit_message>
feat: new member onboarding, re-application flow, invite token system
</commit_message>
<xml_diff>
--- a/Mentor — Competitive Analysis.docx
+++ b/Mentor — Competitive Analysis.docx
@@ -122,7 +122,7 @@
           <w:sz w:val="22"/>
           <w:szCs w:val="22"/>
         </w:rPr>
-        <w:t xml:space="preserve">The gap Mentor can own is specific: a verified, role-specific community for ambitious professionals in India who are sick of performative networking and want real peers, real referrals, and real career acceleration. Not a LinkedIn clone. Not a course platform. Not a data aggregator. A community that makes you feel like you finally found your people — and your people happen to get you jobs, introductions, and promotions.</w:t>
+        <w:t xml:space="preserve">The gap Mentor can own is specific: a verified, role-specific community for ambitious professionals in India who are sick of performative networking and want real peers, real opportunities, and real career acceleration. Not a LinkedIn clone. Not a course platform. Not a data aggregator. A community that makes you feel like you finally found your people — and where employers come directly to your group because the quality of the talent pool makes it worth their while.</w:t>
       </w:r>
     </w:p>
     <w:p>
@@ -3423,7 +3423,7 @@
                 <w:sz w:val="20"/>
                 <w:szCs w:val="20"/>
               </w:rPr>
-              <w:t xml:space="preserve">Users need to know what they are reading: a job, a referral, a resource, a discussion. Unlabelled posts kill signal.</w:t>
+              <w:t xml:space="preserve">Users need to know what they are reading: a job, a resource, a discussion. Unlabelled posts kill signal. Structured post types only.</w:t>
             </w:r>
           </w:p>
         </w:tc>
@@ -3454,7 +3454,7 @@
                 <w:sz w:val="20"/>
                 <w:szCs w:val="20"/>
               </w:rPr>
-              <w:t xml:space="preserve">Job board tab as a standalone feature</w:t>
+              <w:t xml:space="preserve">Standalone Job Board tab (keep job boards inside groups)</w:t>
             </w:r>
           </w:p>
         </w:tc>
@@ -3479,11 +3479,11 @@
             <w:r>
               <w:rPr>
                 <w:rFonts w:ascii="Arial" w:cs="Arial" w:eastAsia="Arial" w:hAnsi="Arial"/>
-                <w:color w:val="92400E"/>
-                <w:sz w:val="20"/>
-                <w:szCs w:val="20"/>
-              </w:rPr>
-              <w:t xml:space="preserve">REDUCE</w:t>
+                <w:color w:val="065F46"/>
+                <w:sz w:val="20"/>
+                <w:szCs w:val="20"/>
+              </w:rPr>
+              <w:t xml:space="preserve">CHANGE</w:t>
             </w:r>
           </w:p>
         </w:tc>
@@ -3512,7 +3512,7 @@
                 <w:sz w:val="20"/>
                 <w:szCs w:val="20"/>
               </w:rPr>
-              <w:t xml:space="preserve">Jobs should live inside group Job Board channels, not as a separate section competing with Naukri. Context is everything.</w:t>
+              <w:t xml:space="preserve">Jobs are the primary proposition — but through groups, not as a separate tab competing with Naukri. A company posting to the Product group reaches 400 verified PMs. That is the product.</w:t>
             </w:r>
           </w:p>
         </w:tc>
@@ -3543,7 +3543,7 @@
                 <w:sz w:val="20"/>
                 <w:szCs w:val="20"/>
               </w:rPr>
-              <w:t xml:space="preserve">'Connect' / friend-request mechanic</w:t>
+              <w:t xml:space="preserve">Platform-led referral mechanic</w:t>
             </w:r>
           </w:p>
         </w:tc>
@@ -3568,11 +3568,11 @@
             <w:r>
               <w:rPr>
                 <w:rFonts w:ascii="Arial" w:cs="Arial" w:eastAsia="Arial" w:hAnsi="Arial"/>
-                <w:color w:val="991B1B"/>
-                <w:sz w:val="20"/>
-                <w:szCs w:val="20"/>
-              </w:rPr>
-              <w:t xml:space="preserve">CUT NOW</w:t>
+                <w:color w:val="92400E"/>
+                <w:sz w:val="20"/>
+                <w:szCs w:val="20"/>
+              </w:rPr>
+              <w:t xml:space="preserve">REDUCE</w:t>
             </w:r>
           </w:p>
         </w:tc>
@@ -3601,7 +3601,7 @@
                 <w:sz w:val="20"/>
                 <w:szCs w:val="20"/>
               </w:rPr>
-              <w:t xml:space="preserve">This is LinkedIn behaviour and creates follower-count anxiety. Mentor does not have followers. You have group membership.</w:t>
+              <w:t xml:space="preserve">Referrals are secondary and user-led. The platform does not broker referrals — it creates the conditions for them. If a Souled Store employee is in the group, a fellow member can reach out. Mentor does not surface or push this; it happens organically.</w:t>
             </w:r>
           </w:p>
         </w:tc>
@@ -3632,7 +3632,7 @@
                 <w:sz w:val="20"/>
                 <w:szCs w:val="20"/>
               </w:rPr>
-              <w:t xml:space="preserve">Notifications for likes and reactions</w:t>
+              <w:t xml:space="preserve">'Connect' / friend-request mechanic</w:t>
             </w:r>
           </w:p>
         </w:tc>
@@ -3657,11 +3657,11 @@
             <w:r>
               <w:rPr>
                 <w:rFonts w:ascii="Arial" w:cs="Arial" w:eastAsia="Arial" w:hAnsi="Arial"/>
-                <w:color w:val="92400E"/>
-                <w:sz w:val="20"/>
-                <w:szCs w:val="20"/>
-              </w:rPr>
-              <w:t xml:space="preserve">REDUCE</w:t>
+                <w:color w:val="991B1B"/>
+                <w:sz w:val="20"/>
+                <w:szCs w:val="20"/>
+              </w:rPr>
+              <w:t xml:space="preserve">CUT NOW</w:t>
             </w:r>
           </w:p>
         </w:tc>
@@ -3690,7 +3690,7 @@
                 <w:sz w:val="20"/>
                 <w:szCs w:val="20"/>
               </w:rPr>
-              <w:t xml:space="preserve">Optimises for dopamine loops. Notify for: DMs, referral requests, application status, job opportunities. Nothing else.</w:t>
+              <w:t xml:space="preserve">This is LinkedIn behaviour and creates follower-count anxiety. Mentor does not have followers. You have group membership.</w:t>
             </w:r>
           </w:p>
         </w:tc>
@@ -3721,7 +3721,7 @@
                 <w:sz w:val="20"/>
                 <w:szCs w:val="20"/>
               </w:rPr>
-              <w:t xml:space="preserve">Public profile pages visible without auth</w:t>
+              <w:t xml:space="preserve">Notifications for likes and reactions</w:t>
             </w:r>
           </w:p>
         </w:tc>
@@ -3746,11 +3746,11 @@
             <w:r>
               <w:rPr>
                 <w:rFonts w:ascii="Arial" w:cs="Arial" w:eastAsia="Arial" w:hAnsi="Arial"/>
-                <w:color w:val="991B1B"/>
-                <w:sz w:val="20"/>
-                <w:szCs w:val="20"/>
-              </w:rPr>
-              <w:t xml:space="preserve">CUT NOW</w:t>
+                <w:color w:val="92400E"/>
+                <w:sz w:val="20"/>
+                <w:szCs w:val="20"/>
+              </w:rPr>
+              <w:t xml:space="preserve">REDUCE</w:t>
             </w:r>
           </w:p>
         </w:tc>
@@ -3779,7 +3779,7 @@
                 <w:sz w:val="20"/>
                 <w:szCs w:val="20"/>
               </w:rPr>
-              <w:t xml:space="preserve">The gated experience IS the product. Letting anyone see profiles reduces the premium feel and kills the exclusivity angle.</w:t>
+              <w:t xml:space="preserve">Optimises for dopamine loops. Notify for: DMs, job matches, application status, new posts in job board channel. Nothing else.</w:t>
             </w:r>
           </w:p>
         </w:tc>
@@ -3810,7 +3810,7 @@
                 <w:sz w:val="20"/>
                 <w:szCs w:val="20"/>
               </w:rPr>
-              <w:t xml:space="preserve">'Experts' section as currently built</w:t>
+              <w:t xml:space="preserve">Public profile pages visible without auth</w:t>
             </w:r>
           </w:p>
         </w:tc>
@@ -3835,11 +3835,11 @@
             <w:r>
               <w:rPr>
                 <w:rFonts w:ascii="Arial" w:cs="Arial" w:eastAsia="Arial" w:hAnsi="Arial"/>
-                <w:color w:val="92400E"/>
-                <w:sz w:val="20"/>
-                <w:szCs w:val="20"/>
-              </w:rPr>
-              <w:t xml:space="preserve">REDUCE</w:t>
+                <w:color w:val="991B1B"/>
+                <w:sz w:val="20"/>
+                <w:szCs w:val="20"/>
+              </w:rPr>
+              <w:t xml:space="preserve">CUT NOW</w:t>
             </w:r>
           </w:p>
         </w:tc>
@@ -3868,7 +3868,7 @@
                 <w:sz w:val="20"/>
                 <w:szCs w:val="20"/>
               </w:rPr>
-              <w:t xml:space="preserve">If experts are not members of a verified group, they are just LinkedIn consultants with a new coat of paint. Tie expert status to group leadership.</w:t>
+              <w:t xml:space="preserve">The gated experience IS the product. Letting anyone see profiles reduces the premium feel and kills the exclusivity angle.</w:t>
             </w:r>
           </w:p>
         </w:tc>
@@ -3899,7 +3899,7 @@
                 <w:sz w:val="20"/>
                 <w:szCs w:val="20"/>
               </w:rPr>
-              <w:t xml:space="preserve">Resume builder feature</w:t>
+              <w:t xml:space="preserve">'Experts' as a standalone section</w:t>
             </w:r>
           </w:p>
         </w:tc>
@@ -3924,11 +3924,11 @@
             <w:r>
               <w:rPr>
                 <w:rFonts w:ascii="Arial" w:cs="Arial" w:eastAsia="Arial" w:hAnsi="Arial"/>
-                <w:color w:val="991B1B"/>
-                <w:sz w:val="20"/>
-                <w:szCs w:val="20"/>
-              </w:rPr>
-              <w:t xml:space="preserve">CUT NOW</w:t>
+                <w:color w:val="065F46"/>
+                <w:sz w:val="20"/>
+                <w:szCs w:val="20"/>
+              </w:rPr>
+              <w:t xml:space="preserve">INTEGRATE</w:t>
             </w:r>
           </w:p>
         </w:tc>
@@ -3957,7 +3957,7 @@
                 <w:sz w:val="20"/>
                 <w:szCs w:val="20"/>
               </w:rPr>
-              <w:t xml:space="preserve">Not differentiated. There are 50 better tools. Mentor's differentiation is the community, not the tooling.</w:t>
+              <w:t xml:space="preserve">Do not remove experts — integrate them into groups as verified group leads or resident experts. An expert who is a member of the Product group and contributes to discussions is legitimate. An expert floating outside groups is a LinkedIn profile in a new coat of paint.</w:t>
             </w:r>
           </w:p>
         </w:tc>
@@ -3988,7 +3988,7 @@
                 <w:sz w:val="20"/>
                 <w:szCs w:val="20"/>
               </w:rPr>
-              <w:t xml:space="preserve">Mock interview as a standalone feature</w:t>
+              <w:t xml:space="preserve">Resume builder feature</w:t>
             </w:r>
           </w:p>
         </w:tc>
@@ -4013,11 +4013,11 @@
             <w:r>
               <w:rPr>
                 <w:rFonts w:ascii="Arial" w:cs="Arial" w:eastAsia="Arial" w:hAnsi="Arial"/>
-                <w:color w:val="92400E"/>
-                <w:sz w:val="20"/>
-                <w:szCs w:val="20"/>
-              </w:rPr>
-              <w:t xml:space="preserve">REDUCE</w:t>
+                <w:color w:val="991B1B"/>
+                <w:sz w:val="20"/>
+                <w:szCs w:val="20"/>
+              </w:rPr>
+              <w:t xml:space="preserve">CUT NOW</w:t>
             </w:r>
           </w:p>
         </w:tc>
@@ -4046,7 +4046,7 @@
                 <w:sz w:val="20"/>
                 <w:szCs w:val="20"/>
               </w:rPr>
-              <w:t xml:space="preserve">Only keep if it is run by verified community members (peer mock interviews). Third-party tools add nothing unique.</w:t>
+              <w:t xml:space="preserve">Not differentiated. There are 50 better tools. Mentor's differentiation is the community and job access, not the tooling.</w:t>
             </w:r>
           </w:p>
         </w:tc>
@@ -4077,6 +4077,95 @@
                 <w:sz w:val="20"/>
                 <w:szCs w:val="20"/>
               </w:rPr>
+              <w:t xml:space="preserve">Mock interview as a standalone feature</w:t>
+            </w:r>
+          </w:p>
+        </w:tc>
+        <w:tc>
+          <w:tcPr>
+            <w:tcW w:type="dxa" w:w="2400"/>
+            <w:tcBorders>
+              <w:top w:val="single" w:color="E5E7EB" w:sz="4"/>
+              <w:left w:val="single" w:color="E5E7EB" w:sz="4"/>
+              <w:bottom w:val="single" w:color="E5E7EB" w:sz="4"/>
+              <w:right w:val="single" w:color="E5E7EB" w:sz="4"/>
+            </w:tcBorders>
+            <w:shd w:fill="F0FDF4" w:val="clear"/>
+            <w:tcMar>
+              <w:top w:type="dxa" w:w="80"/>
+              <w:left w:type="dxa" w:w="120"/>
+              <w:bottom w:type="dxa" w:w="80"/>
+              <w:right w:type="dxa" w:w="120"/>
+            </w:tcMar>
+          </w:tcPr>
+          <w:p>
+            <w:r>
+              <w:rPr>
+                <w:rFonts w:ascii="Arial" w:cs="Arial" w:eastAsia="Arial" w:hAnsi="Arial"/>
+                <w:color w:val="92400E"/>
+                <w:sz w:val="20"/>
+                <w:szCs w:val="20"/>
+              </w:rPr>
+              <w:t xml:space="preserve">REDUCE</w:t>
+            </w:r>
+          </w:p>
+        </w:tc>
+        <w:tc>
+          <w:tcPr>
+            <w:tcW w:type="dxa" w:w="2760"/>
+            <w:tcBorders>
+              <w:top w:val="single" w:color="E5E7EB" w:sz="4"/>
+              <w:left w:val="single" w:color="E5E7EB" w:sz="4"/>
+              <w:bottom w:val="single" w:color="E5E7EB" w:sz="4"/>
+              <w:right w:val="single" w:color="E5E7EB" w:sz="4"/>
+            </w:tcBorders>
+            <w:shd w:fill="F0FDF4" w:val="clear"/>
+            <w:tcMar>
+              <w:top w:type="dxa" w:w="80"/>
+              <w:left w:type="dxa" w:w="120"/>
+              <w:bottom w:type="dxa" w:w="80"/>
+              <w:right w:type="dxa" w:w="120"/>
+            </w:tcMar>
+          </w:tcPr>
+          <w:p>
+            <w:r>
+              <w:rPr>
+                <w:rFonts w:ascii="Arial" w:cs="Arial" w:eastAsia="Arial" w:hAnsi="Arial"/>
+                <w:color w:val="1A1A1A"/>
+                <w:sz w:val="20"/>
+                <w:szCs w:val="20"/>
+              </w:rPr>
+              <w:t xml:space="preserve">Only keep if run by verified community members (peer mock interviews inside the group). Third-party integrations add nothing unique here.</w:t>
+            </w:r>
+          </w:p>
+        </w:tc>
+      </w:tr>
+      <w:tr>
+        <w:tc>
+          <w:tcPr>
+            <w:tcW w:type="dxa" w:w="4200"/>
+            <w:tcBorders>
+              <w:top w:val="single" w:color="E5E7EB" w:sz="4"/>
+              <w:left w:val="single" w:color="E5E7EB" w:sz="4"/>
+              <w:bottom w:val="single" w:color="E5E7EB" w:sz="4"/>
+              <w:right w:val="single" w:color="E5E7EB" w:sz="4"/>
+            </w:tcBorders>
+            <w:shd w:fill="FFFFFF" w:val="clear"/>
+            <w:tcMar>
+              <w:top w:type="dxa" w:w="80"/>
+              <w:left w:type="dxa" w:w="120"/>
+              <w:bottom w:type="dxa" w:w="80"/>
+              <w:right w:type="dxa" w:w="120"/>
+            </w:tcMar>
+          </w:tcPr>
+          <w:p>
+            <w:r>
+              <w:rPr>
+                <w:rFonts w:ascii="Arial" w:cs="Arial" w:eastAsia="Arial" w:hAnsi="Arial"/>
+                <w:color w:val="1A1A1A"/>
+                <w:sz w:val="20"/>
+                <w:szCs w:val="20"/>
+              </w:rPr>
               <w:t xml:space="preserve">Salary tracker without verification layer</w:t>
             </w:r>
           </w:p>
@@ -4090,7 +4179,7 @@
               <w:bottom w:val="single" w:color="E5E7EB" w:sz="4"/>
               <w:right w:val="single" w:color="E5E7EB" w:sz="4"/>
             </w:tcBorders>
-            <w:shd w:fill="F0FDF4" w:val="clear"/>
+            <w:shd w:fill="FFFFFF" w:val="clear"/>
             <w:tcMar>
               <w:top w:type="dxa" w:w="80"/>
               <w:left w:type="dxa" w:w="120"/>
@@ -4119,7 +4208,7 @@
               <w:bottom w:val="single" w:color="E5E7EB" w:sz="4"/>
               <w:right w:val="single" w:color="E5E7EB" w:sz="4"/>
             </w:tcBorders>
-            <w:shd w:fill="F0FDF4" w:val="clear"/>
+            <w:shd w:fill="FFFFFF" w:val="clear"/>
             <w:tcMar>
               <w:top w:type="dxa" w:w="80"/>
               <w:left w:type="dxa" w:w="120"/>
@@ -4272,7 +4361,7 @@
                 <w:sz w:val="28"/>
                 <w:szCs w:val="28"/>
               </w:rPr>
-              <w:t xml:space="preserve">Mentor is the only community for Indian professionals</w:t>
+              <w:t xml:space="preserve">Mentor is where Indian companies hire their best people —</w:t>
             </w:r>
           </w:p>
           <w:p>
@@ -4289,7 +4378,7 @@
                 <w:sz w:val="28"/>
                 <w:szCs w:val="28"/>
               </w:rPr>
-              <w:t xml:space="preserve">where everyone in the room has been verified —</w:t>
+              <w:t xml:space="preserve">by posting directly to verified, role-specific groups</w:t>
             </w:r>
           </w:p>
           <w:p>
@@ -4306,7 +4395,7 @@
                 <w:sz w:val="28"/>
                 <w:szCs w:val="28"/>
               </w:rPr>
-              <w:t xml:space="preserve">and where the conversations actually move your career.</w:t>
+              <w:t xml:space="preserve">instead of a pile of unscreened applications.</w:t>
             </w:r>
           </w:p>
         </w:tc>
@@ -4434,7 +4523,7 @@
           <w:sz w:val="22"/>
           <w:szCs w:val="22"/>
         </w:rPr>
-        <w:t xml:space="preserve">Pillar 3 — CAREER OUTCOMES, NOT ENGAGEMENT</w:t>
+        <w:t xml:space="preserve">Pillar 3 — JOBS THROUGH VERIFIED GROUPS</w:t>
       </w:r>
     </w:p>
     <w:p>
@@ -4448,7 +4537,7 @@
           <w:sz w:val="22"/>
           <w:szCs w:val="22"/>
         </w:rPr>
-        <w:t xml:space="preserve">Mentor tracks referrals given, jobs found, interviews landed — not likes, followers, or impressions. The platform optimises for career outcomes, not time-on-site. This is the fundamental product bet that separates it from everything else.</w:t>
+        <w:t xml:space="preserve">This is the core product and the monetisation model. A company like Souled Store does not post a job to a generic board — they post directly to the Product group and reach 400 verified PMs. Before they go to LinkedIn or Naukri, they come to Mentor because the talent pool is pre-screened and engaged. On top of this, if a Souled Store employee happens to be a group member, they may facilitate an introduction — but that is user-led and secondary. The platform's job is to surface verified talent to employers. That is what companies pay for.</w:t>
       </w:r>
     </w:p>
     <w:p>
@@ -4652,7 +4741,7 @@
                 <w:sz w:val="22"/>
                 <w:szCs w:val="22"/>
               </w:rPr>
-              <w:t xml:space="preserve">A job board. Referrals from peers you trust are the job board.</w:t>
+              <w:t xml:space="preserve">A generic job board. Jobs are group-specific and employer-targeted — not a Naukri clone.</w:t>
             </w:r>
           </w:p>
         </w:tc>
@@ -4743,7 +4832,98 @@
                 <w:sz w:val="22"/>
                 <w:szCs w:val="22"/>
               </w:rPr>
-              <w:t xml:space="preserve">A course platform. The community is the curriculum.</w:t>
+              <w:t xml:space="preserve">A referral platform. Referrals happen between members organically. Mentor does not broker them.</w:t>
+            </w:r>
+          </w:p>
+        </w:tc>
+      </w:tr>
+    </w:tbl>
+    <w:p>
+      <w:pPr>
+        <w:spacing w:after="0" w:before="30"/>
+      </w:pPr>
+      <w:r>
+        <w:t xml:space="preserve"/>
+      </w:r>
+    </w:p>
+    <w:tbl>
+      <w:tblPr>
+        <w:tblW w:type="dxa" w:w="9360"/>
+        <w:tblBorders>
+          <w:top w:val="none" w:color="FFFFFF" w:sz="0"/>
+          <w:left w:val="none" w:color="FFFFFF" w:sz="0"/>
+          <w:bottom w:val="none" w:color="FFFFFF" w:sz="0"/>
+          <w:right w:val="none" w:color="FFFFFF" w:sz="0"/>
+          <w:insideH w:val="single" w:color="auto" w:sz="4"/>
+          <w:insideV w:val="single" w:color="auto" w:sz="4"/>
+        </w:tblBorders>
+      </w:tblPr>
+      <w:tblGrid>
+        <w:gridCol w:w="800"/>
+        <w:gridCol w:w="8560"/>
+      </w:tblGrid>
+      <w:tr>
+        <w:tc>
+          <w:tcPr>
+            <w:tcW w:type="dxa" w:w="800"/>
+            <w:tcBorders>
+              <w:top w:val="none" w:color="FFFFFF" w:sz="0"/>
+              <w:left w:val="none" w:color="FFFFFF" w:sz="0"/>
+              <w:bottom w:val="none" w:color="FFFFFF" w:sz="0"/>
+              <w:right w:val="none" w:color="FFFFFF" w:sz="0"/>
+            </w:tcBorders>
+            <w:shd w:fill="B45309" w:val="clear"/>
+            <w:tcMar>
+              <w:top w:type="dxa" w:w="120"/>
+              <w:left w:type="dxa" w:w="160"/>
+              <w:bottom w:type="dxa" w:w="120"/>
+              <w:right w:type="dxa" w:w="120"/>
+            </w:tcMar>
+            <w:vAlign w:val="center"/>
+          </w:tcPr>
+          <w:p>
+            <w:pPr>
+              <w:jc w:val="center"/>
+            </w:pPr>
+            <w:r>
+              <w:rPr>
+                <w:rFonts w:ascii="Arial" w:cs="Arial" w:eastAsia="Arial" w:hAnsi="Arial"/>
+                <w:b/>
+                <w:bCs/>
+                <w:color w:val="FFFFFF"/>
+                <w:sz w:val="20"/>
+                <w:szCs w:val="20"/>
+              </w:rPr>
+              <w:t xml:space="preserve">NOT</w:t>
+            </w:r>
+          </w:p>
+        </w:tc>
+        <w:tc>
+          <w:tcPr>
+            <w:tcW w:type="dxa" w:w="8560"/>
+            <w:tcBorders>
+              <w:top w:val="none" w:color="FFFFFF" w:sz="0"/>
+              <w:left w:val="none" w:color="FFFFFF" w:sz="0"/>
+              <w:bottom w:val="none" w:color="FFFFFF" w:sz="0"/>
+              <w:right w:val="none" w:color="FFFFFF" w:sz="0"/>
+            </w:tcBorders>
+            <w:shd w:fill="FEF3C7" w:val="clear"/>
+            <w:tcMar>
+              <w:top w:type="dxa" w:w="120"/>
+              <w:left w:type="dxa" w:w="200"/>
+              <w:bottom w:type="dxa" w:w="120"/>
+              <w:right w:type="dxa" w:w="160"/>
+            </w:tcMar>
+          </w:tcPr>
+          <w:p>
+            <w:r>
+              <w:rPr>
+                <w:rFonts w:ascii="Arial" w:cs="Arial" w:eastAsia="Arial" w:hAnsi="Arial"/>
+                <w:color w:val="1A1A1A"/>
+                <w:sz w:val="22"/>
+                <w:szCs w:val="22"/>
+              </w:rPr>
+              <w:t xml:space="preserve">A course platform. The community is the curriculum. Experts live inside groups, not above them.</w:t>
             </w:r>
           </w:p>
         </w:tc>
@@ -6255,7 +6435,7 @@
           <w:sz w:val="22"/>
           <w:szCs w:val="22"/>
         </w:rPr>
-        <w:t xml:space="preserve">They are the PM who got promoted twice but cannot find peers at their seniority to think alongside. The marketing manager at a funded startup who wants to know what really goes on inside Zomato and Swiggy. The engineer who wants to switch to product and needs a real insider view, not a Medium article.</w:t>
+        <w:t xml:space="preserve">They are the PM who got promoted twice but cannot find peers at their seniority to think alongside. The marketing manager at a funded startup who wants to know what really goes on inside Zomato and Swiggy. The engineer who wants to switch to product and needs a real insider view, not a Medium article. And they are the recruiter at a high-growth D2C brand who is tired of sifting through 400 Naukri applications to find the 3 people worth talking to — and would rather post directly to 200 verified PMs who are actively engaged in their domain.</w:t>
       </w:r>
     </w:p>
     <w:p>
@@ -7195,7 +7375,7 @@
           <w:sz w:val="22"/>
           <w:szCs w:val="22"/>
         </w:rPr>
-        <w:t xml:space="preserve">No employer or recruiter story. The most defensible revenue in this space is: recruiters and hiring managers pay to access a pool of verified, engaged professionals. Blind's revenue was largely employer research. Levels.fyi sells compensation benchmarks to employers. What does Mentor sell to companies?</w:t>
+        <w:t xml:space="preserve">The employer posting flow does not exist yet. The core monetisation — companies paying to post jobs directly to verified role groups — is the product, but it has not been built. A Souled Store recruiter cannot currently log in as a company, select 'Product' group, post a job, and reach 400 verified PMs. This is what needs to be built in Q2. Until then, the revenue model exists only in theory.</w:t>
       </w:r>
     </w:p>
     <w:p>
@@ -7692,7 +7872,7 @@
           <w:sz w:val="22"/>
           <w:szCs w:val="22"/>
         </w:rPr>
-        <w:t xml:space="preserve">Build the employer/recruiter access product: verified candidate pool with career outcomes data. This is where revenue lives.</w:t>
+        <w:t xml:space="preserve">Build the employer job posting product: companies pay to post a job directly to one or more verified groups. Model: per post (Rs 5,000–15,000 per job to a group) or monthly subscription for high-volume hirers. Supply side (members) stays free. Demand side (employers) pays. This is the Naukri model inverted — instead of volume, sell precision.</w:t>
       </w:r>
     </w:p>
     <w:p>

</xml_diff>